<commit_message>
Created the search bar option
</commit_message>
<xml_diff>
--- a/certificate-generator/src/assets/OfferLetter.docx
+++ b/certificate-generator/src/assets/OfferLetter.docx
@@ -248,7 +248,6 @@
           <w:bCs/>
         </w:rPr>
       </w:pPr>
-      <w:proofErr w:type="gramStart"/>
       <w:r>
         <w:rPr>
           <w:rFonts w:ascii="Times New Roman" w:eastAsia="Times New Roman" w:hAnsi="Times New Roman" w:cs="Times New Roman"/>
@@ -263,7 +262,6 @@
         </w:rPr>
         <w:t>:</w:t>
       </w:r>
-      <w:proofErr w:type="gramEnd"/>
       <w:r>
         <w:rPr>
           <w:rFonts w:ascii="Times New Roman" w:eastAsia="Times New Roman" w:hAnsi="Times New Roman" w:cs="Times New Roman"/>
@@ -285,7 +283,10 @@
       <w:pPr>
         <w:spacing w:after="200"/>
         <w:rPr>
-          <w:rFonts w:ascii="Times New Roman" w:eastAsia="Times New Roman" w:hAnsi="Times New Roman" w:cs="Times New Roman"/>
+          <w:rFonts w:ascii="Times New Roman" w:eastAsia="Times New Roman" w:hAnsi="Times New Roman"/>
+          <w:b/>
+          <w:bCs/>
+          <w:lang w:val="en-IN"/>
         </w:rPr>
       </w:pPr>
       <w:r>
@@ -302,36 +303,67 @@
           <w:b/>
           <w:bCs/>
         </w:rPr>
+        <w:t>{studentName}</w:t>
+      </w:r>
+      <w:r>
+        <w:rPr>
+          <w:rFonts w:ascii="Times New Roman" w:eastAsia="Times New Roman" w:hAnsi="Times New Roman"/>
+          <w:b/>
+          <w:bCs/>
+        </w:rPr>
+        <w:t xml:space="preserve"> </w:t>
+      </w:r>
+      <w:r>
+        <w:rPr>
+          <w:rFonts w:ascii="Times New Roman" w:eastAsia="Times New Roman" w:hAnsi="Times New Roman"/>
+          <w:b/>
+          <w:bCs/>
+        </w:rPr>
         <w:t>{</w:t>
       </w:r>
-      <w:proofErr w:type="spellStart"/>
       <w:r>
         <w:rPr>
           <w:rFonts w:ascii="Times New Roman" w:eastAsia="Times New Roman" w:hAnsi="Times New Roman"/>
           <w:b/>
           <w:bCs/>
-        </w:rPr>
-        <w:t>studentName</w:t>
-      </w:r>
-      <w:proofErr w:type="spellEnd"/>
+          <w:lang w:val="en-IN"/>
+        </w:rPr>
+        <w:t>lastName</w:t>
+      </w:r>
       <w:r>
         <w:rPr>
           <w:rFonts w:ascii="Times New Roman" w:eastAsia="Times New Roman" w:hAnsi="Times New Roman"/>
           <w:b/>
           <w:bCs/>
         </w:rPr>
-        <w:t>} ({</w:t>
-      </w:r>
-      <w:proofErr w:type="spellStart"/>
+        <w:t>}</w:t>
+      </w:r>
       <w:r>
         <w:rPr>
           <w:rFonts w:ascii="Times New Roman" w:eastAsia="Times New Roman" w:hAnsi="Times New Roman"/>
           <w:b/>
           <w:bCs/>
         </w:rPr>
-        <w:t>studentId</w:t>
-      </w:r>
-      <w:proofErr w:type="spellEnd"/>
+        <w:t xml:space="preserve"> ({</w:t>
+      </w:r>
+      <w:r>
+        <w:rPr>
+          <w:rFonts w:ascii="Times New Roman" w:eastAsia="Times New Roman" w:hAnsi="Times New Roman"/>
+          <w:b/>
+          <w:bCs/>
+          <w:lang w:val="en-IN"/>
+        </w:rPr>
+        <w:t>s</w:t>
+      </w:r>
+      <w:r>
+        <w:rPr>
+          <w:rFonts w:ascii="Times New Roman" w:eastAsia="Times New Roman" w:hAnsi="Times New Roman"/>
+          <w:b/>
+          <w:bCs/>
+          <w:lang w:val="en-IN"/>
+        </w:rPr>
+        <w:t>tudentId</w:t>
+      </w:r>
       <w:r>
         <w:rPr>
           <w:rFonts w:ascii="Times New Roman" w:eastAsia="Times New Roman" w:hAnsi="Times New Roman"/>
@@ -411,25 +443,7 @@
           <w:b/>
           <w:bCs/>
         </w:rPr>
-        <w:t>{</w:t>
-      </w:r>
-      <w:proofErr w:type="spellStart"/>
-      <w:r>
-        <w:rPr>
-          <w:rFonts w:ascii="Times New Roman" w:eastAsia="Times New Roman" w:hAnsi="Times New Roman" w:cs="Times New Roman"/>
-          <w:b/>
-          <w:bCs/>
-        </w:rPr>
-        <w:t>startDate</w:t>
-      </w:r>
-      <w:proofErr w:type="spellEnd"/>
-      <w:r>
-        <w:rPr>
-          <w:rFonts w:ascii="Times New Roman" w:eastAsia="Times New Roman" w:hAnsi="Times New Roman" w:cs="Times New Roman"/>
-          <w:b/>
-          <w:bCs/>
-        </w:rPr>
-        <w:t>}</w:t>
+        <w:t>{startDate}</w:t>
       </w:r>
       <w:r>
         <w:rPr>
@@ -857,7 +871,6 @@
         </w:rPr>
         <w:t xml:space="preserve"> </w:t>
       </w:r>
-      <w:proofErr w:type="gramStart"/>
       <w:r>
         <w:rPr>
           <w:rFonts w:ascii="Times New Roman" w:eastAsia="Times New Roman" w:hAnsi="Times New Roman" w:cs="Times New Roman"/>
@@ -868,7 +881,6 @@
         </w:rPr>
         <w:t>website</w:t>
       </w:r>
-      <w:proofErr w:type="gramEnd"/>
       <w:r>
         <w:rPr>
           <w:rFonts w:ascii="Times New Roman" w:eastAsia="Times New Roman" w:hAnsi="Times New Roman" w:cs="Times New Roman"/>
@@ -1631,7 +1643,6 @@
   <w:style w:type="character" w:default="1" w:styleId="DefaultParagraphFont">
     <w:name w:val="Default Paragraph Font"/>
     <w:uiPriority w:val="1"/>
-    <w:semiHidden/>
     <w:unhideWhenUsed/>
   </w:style>
   <w:style w:type="table" w:default="1" w:styleId="TableNormal">

</xml_diff>